<commit_message>
Add deadline to WBS-30; Add TI WBS-30
</commit_message>
<xml_diff>
--- a/Documentation/Analysis/Task Informations/Open/Team/Task Info WBS-30.docx
+++ b/Documentation/Analysis/Task Informations/Open/Team/Task Info WBS-30.docx
@@ -20,7 +20,7 @@
     </w:p>
     <w:tbl>
       <w:tblPr>
-        <w:tblW w:w="9350" w:type="dxa"/>
+        <w:tblW w:w="9349" w:type="dxa"/>
         <w:jc w:val="right"/>
         <w:tblInd w:w="108" w:type="dxa"/>
         <w:tblBorders>
@@ -35,10 +35,10 @@
         <w:tblLayout w:type="fixed"/>
       </w:tblPr>
       <w:tblGrid>
-        <w:gridCol w:w="2072"/>
-        <w:gridCol w:w="828"/>
-        <w:gridCol w:w="451"/>
-        <w:gridCol w:w="5999"/>
+        <w:gridCol w:w="1878"/>
+        <w:gridCol w:w="784"/>
+        <w:gridCol w:w="689"/>
+        <w:gridCol w:w="5998"/>
       </w:tblGrid>
       <w:tr>
         <w:tblPrEx>
@@ -50,7 +50,7 @@
         </w:trPr>
         <w:tc>
           <w:tcPr>
-            <w:tcW w:type="dxa" w:w="9350"/>
+            <w:tcW w:type="dxa" w:w="9349"/>
             <w:gridSpan w:val="4"/>
             <w:tcBorders>
               <w:top w:val="single" w:color="929292" w:sz="4" w:space="0" w:shadow="0" w:frame="0"/>
@@ -659,11 +659,11 @@
           <w:shd w:val="clear" w:color="auto" w:fill="auto"/>
         </w:tblPrEx>
         <w:trPr>
-          <w:trHeight w:val="347" w:hRule="atLeast"/>
+          <w:trHeight w:val="687" w:hRule="atLeast"/>
         </w:trPr>
         <w:tc>
           <w:tcPr>
-            <w:tcW w:type="dxa" w:w="2072"/>
+            <w:tcW w:type="dxa" w:w="1878"/>
             <w:tcBorders>
               <w:top w:val="single" w:color="929292" w:sz="4" w:space="0" w:shadow="0" w:frame="0"/>
               <w:left w:val="single" w:color="929292" w:sz="4" w:space="0" w:shadow="0" w:frame="0"/>
@@ -694,7 +694,7 @@
         </w:tc>
         <w:tc>
           <w:tcPr>
-            <w:tcW w:type="dxa" w:w="827"/>
+            <w:tcW w:type="dxa" w:w="783"/>
             <w:tcBorders>
               <w:top w:val="single" w:color="929292" w:sz="4" w:space="0" w:shadow="0" w:frame="0"/>
               <w:left w:val="single" w:color="929292" w:sz="4" w:space="0" w:shadow="0" w:frame="0"/>
@@ -725,7 +725,7 @@
         </w:tc>
         <w:tc>
           <w:tcPr>
-            <w:tcW w:type="dxa" w:w="450"/>
+            <w:tcW w:type="dxa" w:w="688"/>
             <w:tcBorders>
               <w:top w:val="single" w:color="929292" w:sz="4" w:space="0" w:shadow="0" w:frame="0"/>
               <w:left w:val="nil"/>
@@ -750,7 +750,7 @@
                 <w:rFonts w:ascii="Chalkboard SE Regular" w:cs="Arial Unicode MS" w:hAnsi="Chalkboard SE Regular" w:eastAsia="Arial Unicode MS"/>
                 <w:rtl w:val="0"/>
               </w:rPr>
-              <w:t>D</w:t>
+              <w:t>hour(s)</w:t>
             </w:r>
           </w:p>
         </w:tc>
@@ -781,7 +781,7 @@
                 <w:rFonts w:ascii="Chalkboard SE Regular" w:cs="Arial Unicode MS" w:hAnsi="Chalkboard SE Regular" w:eastAsia="Arial Unicode MS"/>
                 <w:rtl w:val="0"/>
               </w:rPr>
-              <w:t>3.3</w:t>
+              <w:t>3</w:t>
             </w:r>
           </w:p>
         </w:tc>
@@ -2406,7 +2406,7 @@
                 <w:rFonts w:ascii="Chalkboard SE Regular" w:hAnsi="Chalkboard SE Regular"/>
                 <w:rtl w:val="0"/>
               </w:rPr>
-              <w:t>D</w:t>
+              <w:t>hour(s)</w:t>
             </w:r>
           </w:p>
         </w:tc>
@@ -2479,7 +2479,7 @@
                 <w:rFonts w:ascii="Chalkboard SE Regular" w:hAnsi="Chalkboard SE Regular"/>
                 <w:rtl w:val="0"/>
               </w:rPr>
-              <w:t>7</w:t>
+              <w:t>5</w:t>
             </w:r>
           </w:p>
         </w:tc>
@@ -2536,6 +2536,7 @@
                 <w:shd w:val="nil" w:color="auto" w:fill="auto"/>
                 <w:vertAlign w:val="baseline"/>
                 <w:rtl w:val="0"/>
+                <w:lang w:val="en-US"/>
                 <w14:textOutline>
                   <w14:noFill/>
                 </w14:textOutline>
@@ -2545,7 +2546,7 @@
                   </w14:solidFill>
                 </w14:textFill>
               </w:rPr>
-              <w:t>D</w:t>
+              <w:t>hour(s)</w:t>
             </w:r>
             <w:r>
               <w:rPr/>
@@ -2679,6 +2680,7 @@
                 <w:shd w:val="nil" w:color="auto" w:fill="auto"/>
                 <w:vertAlign w:val="baseline"/>
                 <w:rtl w:val="0"/>
+                <w:lang w:val="en-US"/>
                 <w14:textOutline>
                   <w14:noFill/>
                 </w14:textOutline>
@@ -2688,7 +2690,7 @@
                   </w14:solidFill>
                 </w14:textFill>
               </w:rPr>
-              <w:t>D</w:t>
+              <w:t>hour(s)</w:t>
             </w:r>
             <w:r>
               <w:rPr/>
@@ -2774,7 +2776,7 @@
                 <w:rFonts w:ascii="Chalkboard SE Regular" w:hAnsi="Chalkboard SE Regular"/>
                 <w:rtl w:val="0"/>
               </w:rPr>
-              <w:t>3.3</w:t>
+              <w:t>3</w:t>
             </w:r>
           </w:p>
         </w:tc>
@@ -2831,6 +2833,7 @@
                 <w:shd w:val="nil" w:color="auto" w:fill="auto"/>
                 <w:vertAlign w:val="baseline"/>
                 <w:rtl w:val="0"/>
+                <w:lang w:val="en-US"/>
                 <w14:textOutline>
                   <w14:noFill/>
                 </w14:textOutline>
@@ -2840,7 +2843,7 @@
                   </w14:solidFill>
                 </w14:textFill>
               </w:rPr>
-              <w:t>D</w:t>
+              <w:t>hour(s)</w:t>
             </w:r>
             <w:r>
               <w:rPr/>
@@ -2863,6 +2866,9 @@
       <w:pPr>
         <w:pStyle w:val="Heading"/>
         <w:jc w:val="left"/>
+        <w:rPr>
+          <w:rFonts w:ascii="Chalkboard SE Regular" w:cs="Chalkboard SE Regular" w:hAnsi="Chalkboard SE Regular" w:eastAsia="Chalkboard SE Regular"/>
+        </w:rPr>
       </w:pPr>
       <w:r>
         <w:rPr>
@@ -2871,6 +2877,66 @@
           <w:lang w:val="en-US"/>
         </w:rPr>
         <w:t>Additional Notes</w:t>
+      </w:r>
+    </w:p>
+    <w:p>
+      <w:pPr>
+        <w:pStyle w:val="Body"/>
+        <w:bidi w:val="1"/>
+      </w:pPr>
+      <w:r>
+        <w:rPr>
+          <w:rFonts w:ascii="Arial Unicode MS" w:cs="Mj_Casablanca" w:hAnsi="Arial Unicode MS" w:eastAsia="Arial Unicode MS" w:hint="cs"/>
+          <w:rtl w:val="1"/>
+        </w:rPr>
+        <w:t xml:space="preserve">تقسیم بندی انجام </w:t>
+      </w:r>
+      <w:r>
+        <w:rPr>
+          <w:rFonts w:ascii="Arial Unicode MS" w:cs="Arial Unicode MS" w:hAnsi="Arial Unicode MS" w:eastAsia="Arial Unicode MS"/>
+          <w:b w:val="0"/>
+          <w:bCs w:val="0"/>
+          <w:i w:val="0"/>
+          <w:iCs w:val="0"/>
+          <w:rtl w:val="0"/>
+        </w:rPr>
+        <w:t>CRC</w:t>
+      </w:r>
+      <w:r>
+        <w:rPr>
+          <w:rtl w:val="0"/>
+        </w:rPr>
+        <w:t xml:space="preserve"> </w:t>
+      </w:r>
+      <w:r>
+        <w:rPr>
+          <w:rFonts w:ascii="Arial Unicode MS" w:cs="Arial Unicode MS" w:hAnsi="Arial Unicode MS" w:eastAsia="Arial Unicode MS"/>
+          <w:b w:val="0"/>
+          <w:bCs w:val="0"/>
+          <w:i w:val="0"/>
+          <w:iCs w:val="0"/>
+          <w:rtl w:val="0"/>
+        </w:rPr>
+        <w:t>Cards</w:t>
+      </w:r>
+      <w:r>
+        <w:rPr>
+          <w:rtl w:val="0"/>
+        </w:rPr>
+        <w:t xml:space="preserve"> </w:t>
+      </w:r>
+      <w:r>
+        <w:rPr>
+          <w:rFonts w:ascii="Arial Unicode MS" w:cs="Mj_Casablanca" w:hAnsi="Arial Unicode MS" w:eastAsia="Arial Unicode MS" w:hint="cs"/>
+          <w:rtl w:val="1"/>
+        </w:rPr>
+        <w:t>را پس از توافق تیم انجام خواهیم داد</w:t>
+      </w:r>
+      <w:r>
+        <w:rPr>
+          <w:rtl w:val="1"/>
+        </w:rPr>
+        <w:t>.</w:t>
       </w:r>
     </w:p>
     <w:sectPr>
@@ -2936,7 +3002,7 @@
         <w:rtl w:val="0"/>
         <w:lang w:val="en-US"/>
       </w:rPr>
-      <w:t>1405/NN/NN</w:t>
+      <w:t>1405/3/1</w:t>
     </w:r>
     <w:r>
       <w:rPr>

</xml_diff>